<commit_message>
docs(ms67): publish completed execution receipts and website status
</commit_message>
<xml_diff>
--- a/docs/milestones/MS-54/MS-54.docx
+++ b/docs/milestones/MS-54/MS-54.docx
@@ -95,7 +95,7 @@
               <w:rPr>
                 <w:rFonts w:ascii="Arial" w:hAnsi="Arial"/>
               </w:rPr>
-              <w:t>Complete</w:t>
+              <w:t>Complete - execution passed</w:t>
             </w:r>
           </w:p>
         </w:tc>
@@ -236,6 +236,49 @@
         </w:tc>
       </w:tr>
     </w:tbl>
+    <w:p>
+      <w:pPr>
+        <w:pStyle w:val="Heading1"/>
+      </w:pPr>
+      <w:r>
+        <w:t>Published execution result</w:t>
+      </w:r>
+    </w:p>
+    <w:p>
+      <w:r>
+        <w:t>Published 2026-09-11: Source build and bounded Oracle runtime. The original signed receipt is retained in the completed MS67 evidence chain.</w:t>
+      </w:r>
+    </w:p>
+    <w:p>
+      <w:hyperlink r:id="rId11">
+        <w:r>
+          <w:rPr>
+            <w:color w:val="6942D6"/>
+          </w:rPr>
+          <w:t>Original signed receipt 1</w:t>
+        </w:r>
+      </w:hyperlink>
+    </w:p>
+    <w:p>
+      <w:hyperlink r:id="rId12">
+        <w:r>
+          <w:rPr>
+            <w:color w:val="6942D6"/>
+          </w:rPr>
+          <w:t>Original signed receipt 2</w:t>
+        </w:r>
+      </w:hyperlink>
+    </w:p>
+    <w:p>
+      <w:hyperlink r:id="rId13">
+        <w:r>
+          <w:rPr>
+            <w:color w:val="6942D6"/>
+          </w:rPr>
+          <w:t>Full MS54–67 execution evidence index</w:t>
+        </w:r>
+      </w:hyperlink>
+    </w:p>
     <w:p>
       <w:pPr>
         <w:pStyle w:val="Heading1"/>
@@ -406,7 +449,7 @@
         <w:pStyle w:val="ListBullet"/>
       </w:pPr>
       <w:r>
-        <w:t>The committed readiness receipt says ready-to-execute-not-observed because this development environment has not produced an authorized Java 21, Docker, and Oracle execution receipt.</w:t>
+        <w:t>These boundaries describe MS #54's own evidence scope. Later MS65, MS66 and MS67 receipts add their separate nonproduction qualifications; they do not rewrite this milestone's signed fields.</w:t>
       </w:r>
     </w:p>
     <w:p>

</xml_diff>

<commit_message>
docs(ms67): publish completed execution receipts and website status (#186)
* docs(ms67): publish completed execution receipts and website status

* fix(docs): use explicit UTF-8 for cross-platform receipt publication

* test(explorer): assert the published CloudBank execution scope
</commit_message>
<xml_diff>
--- a/docs/milestones/MS-54/MS-54.docx
+++ b/docs/milestones/MS-54/MS-54.docx
@@ -95,7 +95,7 @@
               <w:rPr>
                 <w:rFonts w:ascii="Arial" w:hAnsi="Arial"/>
               </w:rPr>
-              <w:t>Complete</w:t>
+              <w:t>Complete - execution passed</w:t>
             </w:r>
           </w:p>
         </w:tc>
@@ -236,6 +236,49 @@
         </w:tc>
       </w:tr>
     </w:tbl>
+    <w:p>
+      <w:pPr>
+        <w:pStyle w:val="Heading1"/>
+      </w:pPr>
+      <w:r>
+        <w:t>Published execution result</w:t>
+      </w:r>
+    </w:p>
+    <w:p>
+      <w:r>
+        <w:t>Published 2026-09-11: Source build and bounded Oracle runtime. The original signed receipt is retained in the completed MS67 evidence chain.</w:t>
+      </w:r>
+    </w:p>
+    <w:p>
+      <w:hyperlink r:id="rId11">
+        <w:r>
+          <w:rPr>
+            <w:color w:val="6942D6"/>
+          </w:rPr>
+          <w:t>Original signed receipt 1</w:t>
+        </w:r>
+      </w:hyperlink>
+    </w:p>
+    <w:p>
+      <w:hyperlink r:id="rId12">
+        <w:r>
+          <w:rPr>
+            <w:color w:val="6942D6"/>
+          </w:rPr>
+          <w:t>Original signed receipt 2</w:t>
+        </w:r>
+      </w:hyperlink>
+    </w:p>
+    <w:p>
+      <w:hyperlink r:id="rId13">
+        <w:r>
+          <w:rPr>
+            <w:color w:val="6942D6"/>
+          </w:rPr>
+          <w:t>Full MS54–67 execution evidence index</w:t>
+        </w:r>
+      </w:hyperlink>
+    </w:p>
     <w:p>
       <w:pPr>
         <w:pStyle w:val="Heading1"/>
@@ -406,7 +449,7 @@
         <w:pStyle w:val="ListBullet"/>
       </w:pPr>
       <w:r>
-        <w:t>The committed readiness receipt says ready-to-execute-not-observed because this development environment has not produced an authorized Java 21, Docker, and Oracle execution receipt.</w:t>
+        <w:t>These boundaries describe MS #54's own evidence scope. Later MS65, MS66 and MS67 receipts add their separate nonproduction qualifications; they do not rewrite this milestone's signed fields.</w:t>
       </w:r>
     </w:p>
     <w:p>

</xml_diff>